<commit_message>
chore: guarda identidad visual, presentación y documentación actuales
</commit_message>
<xml_diff>
--- a/docs/Plan de entrega y estimación - Renta y 720.docx
+++ b/docs/Plan de entrega y estimación - Renta y 720.docx
@@ -4,7 +4,7 @@
   <w:body>
     <w:p>
       <w:pPr>
-        <w:ind w:left="720" w:hanging="720"/>
+        <w:ind w:left="2160" w:hanging="2160"/>
       </w:pPr>
     </w:p>
     <w:p/>
@@ -2224,7 +2224,15 @@
         <w:t>Opción A – En servidores de RCD:</w:t>
       </w:r>
       <w:r>
-        <w:t xml:space="preserve"> entregamos la aplicación instalada en la infraestructura de RCD, cuyo equipo de IT la opera. Máximo control interno; depende de la disponibilidad de IT para aprovisionar entornos.</w:t>
+        <w:t xml:space="preserve"> entregamos la aplicación instalada en la infraestructura de RCD, cuyo equipo de IT la </w:t>
+      </w:r>
+      <w:proofErr w:type="spellStart"/>
+      <w:r>
+        <w:t>opera</w:t>
+      </w:r>
+      <w:proofErr w:type="spellEnd"/>
+      <w:r>
+        <w:t>. Máximo control interno; depende de la disponibilidad de IT para aprovisionar entornos.</w:t>
       </w:r>
     </w:p>
     <w:p>
@@ -2673,7 +2681,21 @@
               <w:rPr>
                 <w:sz w:val="18"/>
               </w:rPr>
-              <w:t>Alto: servidores, red, backups, parches</w:t>
+              <w:t xml:space="preserve">Alto: servidores, red, </w:t>
+            </w:r>
+            <w:proofErr w:type="spellStart"/>
+            <w:r>
+              <w:rPr>
+                <w:sz w:val="18"/>
+              </w:rPr>
+              <w:t>backups</w:t>
+            </w:r>
+            <w:proofErr w:type="spellEnd"/>
+            <w:r>
+              <w:rPr>
+                <w:sz w:val="18"/>
+              </w:rPr>
+              <w:t>, parches</w:t>
             </w:r>
           </w:p>
         </w:tc>
@@ -2755,8 +2777,17 @@
                 <w:color w:val="FFFFFF"/>
                 <w:sz w:val="18"/>
               </w:rPr>
-              <w:t>Cuota de servicio + consumo cloud</w:t>
-            </w:r>
+              <w:t xml:space="preserve">Cuota de servicio + consumo </w:t>
+            </w:r>
+            <w:proofErr w:type="spellStart"/>
+            <w:r>
+              <w:rPr>
+                <w:color w:val="FFFFFF"/>
+                <w:sz w:val="18"/>
+              </w:rPr>
+              <w:t>cloud</w:t>
+            </w:r>
+            <w:proofErr w:type="spellEnd"/>
           </w:p>
         </w:tc>
       </w:tr>
@@ -3287,8 +3318,16 @@
               <w:rPr>
                 <w:sz w:val="18"/>
               </w:rPr>
-              <w:t>PH con revisión y edición del socio, versiones, renegociación y firma electrónica con Signaturit</w:t>
-            </w:r>
+              <w:t xml:space="preserve">PH con revisión y edición del socio, versiones, renegociación y firma electrónica con </w:t>
+            </w:r>
+            <w:proofErr w:type="spellStart"/>
+            <w:r>
+              <w:rPr>
+                <w:sz w:val="18"/>
+              </w:rPr>
+              <w:t>Signaturit</w:t>
+            </w:r>
+            <w:proofErr w:type="spellEnd"/>
           </w:p>
         </w:tc>
         <w:tc>
@@ -3363,8 +3402,16 @@
               <w:rPr>
                 <w:sz w:val="18"/>
               </w:rPr>
-              <w:t>Decisión PBC y consulta WorldCheck</w:t>
-            </w:r>
+              <w:t xml:space="preserve">Decisión PBC y consulta </w:t>
+            </w:r>
+            <w:proofErr w:type="spellStart"/>
+            <w:r>
+              <w:rPr>
+                <w:sz w:val="18"/>
+              </w:rPr>
+              <w:t>WorldCheck</w:t>
+            </w:r>
+            <w:proofErr w:type="spellEnd"/>
           </w:p>
         </w:tc>
       </w:tr>
@@ -3465,7 +3512,21 @@
               <w:rPr>
                 <w:sz w:val="18"/>
               </w:rPr>
-              <w:t>Portal del cliente, checklist, versiones, antivirus y cuarentena, entrega explícita y aviso al abogado</w:t>
+              <w:t xml:space="preserve">Portal del cliente, </w:t>
+            </w:r>
+            <w:proofErr w:type="spellStart"/>
+            <w:r>
+              <w:rPr>
+                <w:sz w:val="18"/>
+              </w:rPr>
+              <w:t>checklist</w:t>
+            </w:r>
+            <w:proofErr w:type="spellEnd"/>
+            <w:r>
+              <w:rPr>
+                <w:sz w:val="18"/>
+              </w:rPr>
+              <w:t>, versiones, antivirus y cuarentena, entrega explícita y aviso al abogado</w:t>
             </w:r>
           </w:p>
         </w:tc>
@@ -3584,8 +3645,16 @@
               <w:rPr>
                 <w:sz w:val="18"/>
               </w:rPr>
-              <w:t>Extractor de datos con IA, revisión humana y Excel para Criteria</w:t>
-            </w:r>
+              <w:t xml:space="preserve">Extractor de datos con IA, revisión humana y Excel para </w:t>
+            </w:r>
+            <w:proofErr w:type="spellStart"/>
+            <w:r>
+              <w:rPr>
+                <w:sz w:val="18"/>
+              </w:rPr>
+              <w:t>Criteria</w:t>
+            </w:r>
+            <w:proofErr w:type="spellEnd"/>
           </w:p>
         </w:tc>
         <w:tc>
@@ -3601,8 +3670,16 @@
               <w:rPr>
                 <w:sz w:val="18"/>
               </w:rPr>
-              <w:t>Carga del Excel en Criteria</w:t>
-            </w:r>
+              <w:t xml:space="preserve">Carga del Excel en </w:t>
+            </w:r>
+            <w:proofErr w:type="spellStart"/>
+            <w:r>
+              <w:rPr>
+                <w:sz w:val="18"/>
+              </w:rPr>
+              <w:t>Criteria</w:t>
+            </w:r>
+            <w:proofErr w:type="spellEnd"/>
           </w:p>
         </w:tc>
       </w:tr>
@@ -3707,7 +3784,23 @@
                 <w:color w:val="FFFFFF"/>
                 <w:sz w:val="18"/>
               </w:rPr>
-              <w:t>SSO, MFA, roles, auditoría, notificaciones Teams opcionales, cuadro de mando y exportaciones</w:t>
+              <w:t xml:space="preserve">SSO, MFA, roles, auditoría, notificaciones </w:t>
+            </w:r>
+            <w:proofErr w:type="spellStart"/>
+            <w:r>
+              <w:rPr>
+                <w:color w:val="FFFFFF"/>
+                <w:sz w:val="18"/>
+              </w:rPr>
+              <w:t>Teams</w:t>
+            </w:r>
+            <w:proofErr w:type="spellEnd"/>
+            <w:r>
+              <w:rPr>
+                <w:color w:val="FFFFFF"/>
+                <w:sz w:val="18"/>
+              </w:rPr>
+              <w:t xml:space="preserve"> opcionales, cuadro de mando y exportaciones</w:t>
             </w:r>
           </w:p>
         </w:tc>
@@ -3794,7 +3887,15 @@
         <w:pStyle w:val="Ttulo3"/>
       </w:pPr>
       <w:r>
-        <w:t>Fase 0 · Arranque y diseño  (S1–S2)</w:t>
+        <w:t xml:space="preserve">Fase 0 · Arranque y </w:t>
+      </w:r>
+      <w:proofErr w:type="gramStart"/>
+      <w:r>
+        <w:t>diseño  (</w:t>
+      </w:r>
+      <w:proofErr w:type="gramEnd"/>
+      <w:r>
+        <w:t>S1–S2)</w:t>
       </w:r>
     </w:p>
     <w:p>
@@ -3860,7 +3961,15 @@
         <w:pStyle w:val="Ttulo3"/>
       </w:pPr>
       <w:r>
-        <w:t>Fase 1 · Plataforma base segura  (S2–S6)</w:t>
+        <w:t xml:space="preserve">Fase 1 · Plataforma base </w:t>
+      </w:r>
+      <w:proofErr w:type="gramStart"/>
+      <w:r>
+        <w:t>segura  (</w:t>
+      </w:r>
+      <w:proofErr w:type="gramEnd"/>
+      <w:r>
+        <w:t>S2–S6)</w:t>
       </w:r>
     </w:p>
     <w:p>
@@ -3913,7 +4022,15 @@
         <w:pStyle w:val="Ttulo3"/>
       </w:pPr>
       <w:r>
-        <w:t>Fase 2 · Captación y gestión del expediente  (S3–S9)</w:t>
+        <w:t xml:space="preserve">Fase 2 · Captación y gestión del </w:t>
+      </w:r>
+      <w:proofErr w:type="gramStart"/>
+      <w:r>
+        <w:t>expediente  (</w:t>
+      </w:r>
+      <w:proofErr w:type="gramEnd"/>
+      <w:r>
+        <w:t>S3–S9)</w:t>
       </w:r>
     </w:p>
     <w:p>
@@ -3931,7 +4048,15 @@
         <w:spacing w:after="40"/>
       </w:pPr>
       <w:r>
-        <w:t>Propuesta de honorarios, firma Signaturit, validaciones, PBC y exportación NAV.</w:t>
+        <w:t xml:space="preserve">Propuesta de honorarios, firma </w:t>
+      </w:r>
+      <w:proofErr w:type="spellStart"/>
+      <w:r>
+        <w:t>Signaturit</w:t>
+      </w:r>
+      <w:proofErr w:type="spellEnd"/>
+      <w:r>
+        <w:t>, validaciones, PBC y exportación NAV.</w:t>
       </w:r>
     </w:p>
     <w:p>
@@ -3972,7 +4097,15 @@
         <w:pStyle w:val="Ttulo3"/>
       </w:pPr>
       <w:r>
-        <w:t>Fase 3 · Modelo 720  (S7–S12)</w:t>
+        <w:t xml:space="preserve">Fase 3 · Modelo </w:t>
+      </w:r>
+      <w:proofErr w:type="gramStart"/>
+      <w:r>
+        <w:t>720  (</w:t>
+      </w:r>
+      <w:proofErr w:type="gramEnd"/>
+      <w:r>
+        <w:t>S7–S12)</w:t>
       </w:r>
     </w:p>
     <w:p>
@@ -3981,7 +4114,15 @@
         <w:spacing w:after="40"/>
       </w:pPr>
       <w:r>
-        <w:t>Extractor con IA, revisión humana, Excel para Criteria, presentación y cierre.</w:t>
+        <w:t xml:space="preserve">Extractor con IA, revisión humana, Excel para </w:t>
+      </w:r>
+      <w:proofErr w:type="spellStart"/>
+      <w:r>
+        <w:t>Criteria</w:t>
+      </w:r>
+      <w:proofErr w:type="spellEnd"/>
+      <w:r>
+        <w:t>, presentación y cierre.</w:t>
       </w:r>
     </w:p>
     <w:p>
@@ -4032,7 +4173,15 @@
         <w:pStyle w:val="Ttulo3"/>
       </w:pPr>
       <w:r>
-        <w:t>Fase 4 · Renta  (S9–S14)</w:t>
+        <w:t xml:space="preserve">Fase 4 · </w:t>
+      </w:r>
+      <w:proofErr w:type="gramStart"/>
+      <w:r>
+        <w:t>Renta  (</w:t>
+      </w:r>
+      <w:proofErr w:type="gramEnd"/>
+      <w:r>
+        <w:t>S9–S14)</w:t>
       </w:r>
     </w:p>
     <w:p>
@@ -4085,7 +4234,15 @@
         <w:pStyle w:val="Ttulo3"/>
       </w:pPr>
       <w:r>
-        <w:t>Fase 5 · Acompañamiento  (4 semanas tras cada PRO)</w:t>
+        <w:t xml:space="preserve">Fase 5 · </w:t>
+      </w:r>
+      <w:proofErr w:type="gramStart"/>
+      <w:r>
+        <w:t>Acompañamiento  (</w:t>
+      </w:r>
+      <w:proofErr w:type="gramEnd"/>
+      <w:r>
+        <w:t>4 semanas tras cada PRO)</w:t>
       </w:r>
     </w:p>
     <w:p>
@@ -4093,8 +4250,13 @@
         <w:pStyle w:val="Listaconvietas"/>
         <w:spacing w:after="40"/>
       </w:pPr>
+      <w:proofErr w:type="spellStart"/>
       <w:r>
-        <w:t>Hypercare con resolución prioritaria y ajustes menores.</w:t>
+        <w:t>Hypercare</w:t>
+      </w:r>
+      <w:proofErr w:type="spellEnd"/>
+      <w:r>
+        <w:t xml:space="preserve"> con resolución prioritaria y ajustes menores.</w:t>
       </w:r>
     </w:p>
     <w:p>
@@ -4485,7 +4647,21 @@
               <w:rPr>
                 <w:sz w:val="18"/>
               </w:rPr>
-              <w:t>Evolución del snapshot actual a un modelo relacional por cliente/expediente, índices, concurrencia por expediente y migraciones.</w:t>
+              <w:t xml:space="preserve">Evolución del </w:t>
+            </w:r>
+            <w:proofErr w:type="spellStart"/>
+            <w:r>
+              <w:rPr>
+                <w:sz w:val="18"/>
+              </w:rPr>
+              <w:t>snapshot</w:t>
+            </w:r>
+            <w:proofErr w:type="spellEnd"/>
+            <w:r>
+              <w:rPr>
+                <w:sz w:val="18"/>
+              </w:rPr>
+              <w:t xml:space="preserve"> actual a un modelo relacional por cliente/expediente, índices, concurrencia por expediente y migraciones.</w:t>
             </w:r>
           </w:p>
         </w:tc>
@@ -4544,7 +4720,21 @@
               <w:rPr>
                 <w:sz w:val="18"/>
               </w:rPr>
-              <w:t>Importación de clientes, segmentos, plantillas, envío real de correo con rebotes, formularios, planificador durable (7/3 y 3 días) y aviso Teams opcional.</w:t>
+              <w:t xml:space="preserve">Importación de clientes, segmentos, plantillas, envío real de correo con rebotes, formularios, planificador durable (7/3 y 3 días) y aviso </w:t>
+            </w:r>
+            <w:proofErr w:type="spellStart"/>
+            <w:r>
+              <w:rPr>
+                <w:sz w:val="18"/>
+              </w:rPr>
+              <w:t>Teams</w:t>
+            </w:r>
+            <w:proofErr w:type="spellEnd"/>
+            <w:r>
+              <w:rPr>
+                <w:sz w:val="18"/>
+              </w:rPr>
+              <w:t xml:space="preserve"> opcional.</w:t>
             </w:r>
           </w:p>
         </w:tc>
@@ -4604,7 +4794,21 @@
               <w:rPr>
                 <w:sz w:val="18"/>
               </w:rPr>
-              <w:t>PH con revisión de socio y versiones, firma electrónica (Signaturit), DNI/certificado/autorización, incidencias PBC y exportación para NAV.</w:t>
+              <w:t>PH con revisión de socio y versiones, firma electrónica (</w:t>
+            </w:r>
+            <w:proofErr w:type="spellStart"/>
+            <w:r>
+              <w:rPr>
+                <w:sz w:val="18"/>
+              </w:rPr>
+              <w:t>Signaturit</w:t>
+            </w:r>
+            <w:proofErr w:type="spellEnd"/>
+            <w:r>
+              <w:rPr>
+                <w:sz w:val="18"/>
+              </w:rPr>
+              <w:t>), DNI/certificado/autorización, incidencias PBC y exportación para NAV.</w:t>
             </w:r>
           </w:p>
         </w:tc>
@@ -4663,7 +4867,35 @@
               <w:rPr>
                 <w:sz w:val="18"/>
               </w:rPr>
-              <w:t>Portal multiexpediente, checklist, versiones, cuarentena y análisis antivirus, almacenamiento privado, entrega explícita al profesional.</w:t>
+              <w:t xml:space="preserve">Portal </w:t>
+            </w:r>
+            <w:proofErr w:type="spellStart"/>
+            <w:r>
+              <w:rPr>
+                <w:sz w:val="18"/>
+              </w:rPr>
+              <w:t>multiexpediente</w:t>
+            </w:r>
+            <w:proofErr w:type="spellEnd"/>
+            <w:r>
+              <w:rPr>
+                <w:sz w:val="18"/>
+              </w:rPr>
+              <w:t xml:space="preserve">, </w:t>
+            </w:r>
+            <w:proofErr w:type="spellStart"/>
+            <w:r>
+              <w:rPr>
+                <w:sz w:val="18"/>
+              </w:rPr>
+              <w:t>checklist</w:t>
+            </w:r>
+            <w:proofErr w:type="spellEnd"/>
+            <w:r>
+              <w:rPr>
+                <w:sz w:val="18"/>
+              </w:rPr>
+              <w:t>, versiones, cuarentena y análisis antivirus, almacenamiento privado, entrega explícita al profesional.</w:t>
             </w:r>
           </w:p>
         </w:tc>
@@ -4723,7 +4955,49 @@
               <w:rPr>
                 <w:sz w:val="18"/>
               </w:rPr>
-              <w:t>Integración del extractor (Copilot / Azure OpenAI), revisión humana, Excel para carga manual en Criteria, presentación, justificante y cierre.</w:t>
+              <w:t>Integración del extractor (</w:t>
+            </w:r>
+            <w:proofErr w:type="spellStart"/>
+            <w:r>
+              <w:rPr>
+                <w:sz w:val="18"/>
+              </w:rPr>
+              <w:t>Copilot</w:t>
+            </w:r>
+            <w:proofErr w:type="spellEnd"/>
+            <w:r>
+              <w:rPr>
+                <w:sz w:val="18"/>
+              </w:rPr>
+              <w:t xml:space="preserve"> / Azure </w:t>
+            </w:r>
+            <w:proofErr w:type="spellStart"/>
+            <w:r>
+              <w:rPr>
+                <w:sz w:val="18"/>
+              </w:rPr>
+              <w:t>OpenAI</w:t>
+            </w:r>
+            <w:proofErr w:type="spellEnd"/>
+            <w:r>
+              <w:rPr>
+                <w:sz w:val="18"/>
+              </w:rPr>
+              <w:t xml:space="preserve">), revisión humana, Excel para carga manual en </w:t>
+            </w:r>
+            <w:proofErr w:type="spellStart"/>
+            <w:r>
+              <w:rPr>
+                <w:sz w:val="18"/>
+              </w:rPr>
+              <w:t>Criteria</w:t>
+            </w:r>
+            <w:proofErr w:type="spellEnd"/>
+            <w:r>
+              <w:rPr>
+                <w:sz w:val="18"/>
+              </w:rPr>
+              <w:t>, presentación, justificante y cierre.</w:t>
             </w:r>
           </w:p>
         </w:tc>
@@ -4842,7 +5116,21 @@
               <w:rPr>
                 <w:sz w:val="18"/>
               </w:rPr>
-              <w:t>Gestión de campañas, plantillas y catálogos; eliminación de reset, reloj de demo, selector de rol y datos ficticios.</w:t>
+              <w:t xml:space="preserve">Gestión de campañas, plantillas y catálogos; eliminación de </w:t>
+            </w:r>
+            <w:proofErr w:type="spellStart"/>
+            <w:r>
+              <w:rPr>
+                <w:sz w:val="18"/>
+              </w:rPr>
+              <w:t>reset</w:t>
+            </w:r>
+            <w:proofErr w:type="spellEnd"/>
+            <w:r>
+              <w:rPr>
+                <w:sz w:val="18"/>
+              </w:rPr>
+              <w:t>, reloj de demo, selector de rol y datos ficticios.</w:t>
             </w:r>
           </w:p>
         </w:tc>
@@ -4901,7 +5189,21 @@
               <w:rPr>
                 <w:sz w:val="18"/>
               </w:rPr>
-              <w:t>Pruebas unitarias, API y Playwright por entrega; rendimiento, accesibilidad (WCAG 2.2 AA) y prueba de restauración.</w:t>
+              <w:t xml:space="preserve">Pruebas unitarias, API y </w:t>
+            </w:r>
+            <w:proofErr w:type="spellStart"/>
+            <w:r>
+              <w:rPr>
+                <w:sz w:val="18"/>
+              </w:rPr>
+              <w:t>Playwright</w:t>
+            </w:r>
+            <w:proofErr w:type="spellEnd"/>
+            <w:r>
+              <w:rPr>
+                <w:sz w:val="18"/>
+              </w:rPr>
+              <w:t xml:space="preserve"> por entrega; rendimiento, accesibilidad (WCAG 2.2 AA) y prueba de restauración.</w:t>
             </w:r>
           </w:p>
         </w:tc>
@@ -5062,8 +5364,17 @@
                 <w:b/>
                 <w:sz w:val="18"/>
               </w:rPr>
-              <w:t>Acompañamiento post-arranque</w:t>
-            </w:r>
+              <w:t xml:space="preserve">Acompañamiento </w:t>
+            </w:r>
+            <w:proofErr w:type="spellStart"/>
+            <w:r>
+              <w:rPr>
+                <w:b/>
+                <w:sz w:val="18"/>
+              </w:rPr>
+              <w:t>post-arranque</w:t>
+            </w:r>
+            <w:proofErr w:type="spellEnd"/>
           </w:p>
         </w:tc>
         <w:tc>
@@ -5076,11 +5387,19 @@
             <w:pPr>
               <w:spacing w:after="0"/>
             </w:pPr>
-            <w:r>
-              <w:rPr>
-                <w:sz w:val="18"/>
-              </w:rPr>
-              <w:t>Hypercare de 4 semanas tras cada puesta en producción: resolución prioritaria y ajustes menores.</w:t>
+            <w:proofErr w:type="spellStart"/>
+            <w:r>
+              <w:rPr>
+                <w:sz w:val="18"/>
+              </w:rPr>
+              <w:t>Hypercare</w:t>
+            </w:r>
+            <w:proofErr w:type="spellEnd"/>
+            <w:r>
+              <w:rPr>
+                <w:sz w:val="18"/>
+              </w:rPr>
+              <w:t xml:space="preserve"> de 4 semanas tras cada puesta en producción: resolución prioritaria y ajustes menores.</w:t>
             </w:r>
           </w:p>
         </w:tc>
@@ -5595,11 +5914,33 @@
             <w:pPr>
               <w:spacing w:after="0"/>
             </w:pPr>
-            <w:r>
-              <w:rPr>
-                <w:sz w:val="18"/>
-              </w:rPr>
-              <w:t>Runbooks de arranque, backup/restauración, supervisión e incidencias; dos sesiones de traspaso.</w:t>
+            <w:proofErr w:type="spellStart"/>
+            <w:r>
+              <w:rPr>
+                <w:sz w:val="18"/>
+              </w:rPr>
+              <w:t>Runbooks</w:t>
+            </w:r>
+            <w:proofErr w:type="spellEnd"/>
+            <w:r>
+              <w:rPr>
+                <w:sz w:val="18"/>
+              </w:rPr>
+              <w:t xml:space="preserve"> de arranque, </w:t>
+            </w:r>
+            <w:proofErr w:type="spellStart"/>
+            <w:r>
+              <w:rPr>
+                <w:sz w:val="18"/>
+              </w:rPr>
+              <w:t>backup</w:t>
+            </w:r>
+            <w:proofErr w:type="spellEnd"/>
+            <w:r>
+              <w:rPr>
+                <w:sz w:val="18"/>
+              </w:rPr>
+              <w:t>/restauración, supervisión e incidencias; dos sesiones de traspaso.</w:t>
             </w:r>
           </w:p>
         </w:tc>
@@ -5793,7 +6134,23 @@
                 <w:b/>
                 <w:sz w:val="18"/>
               </w:rPr>
-              <w:t>Arquitectura cloud e infraestructura como código</w:t>
+              <w:t xml:space="preserve">Arquitectura </w:t>
+            </w:r>
+            <w:proofErr w:type="spellStart"/>
+            <w:r>
+              <w:rPr>
+                <w:b/>
+                <w:sz w:val="18"/>
+              </w:rPr>
+              <w:t>cloud</w:t>
+            </w:r>
+            <w:proofErr w:type="spellEnd"/>
+            <w:r>
+              <w:rPr>
+                <w:b/>
+                <w:sz w:val="18"/>
+              </w:rPr>
+              <w:t xml:space="preserve"> e infraestructura como código</w:t>
             </w:r>
           </w:p>
         </w:tc>
@@ -5912,7 +6269,23 @@
                 <w:b/>
                 <w:sz w:val="18"/>
               </w:rPr>
-              <w:t>Supervisión, alertas, backups y recuperación</w:t>
+              <w:t xml:space="preserve">Supervisión, alertas, </w:t>
+            </w:r>
+            <w:proofErr w:type="spellStart"/>
+            <w:r>
+              <w:rPr>
+                <w:b/>
+                <w:sz w:val="18"/>
+              </w:rPr>
+              <w:t>backups</w:t>
+            </w:r>
+            <w:proofErr w:type="spellEnd"/>
+            <w:r>
+              <w:rPr>
+                <w:b/>
+                <w:sz w:val="18"/>
+              </w:rPr>
+              <w:t xml:space="preserve"> y recuperación</w:t>
             </w:r>
           </w:p>
         </w:tc>
@@ -5929,7 +6302,21 @@
               <w:rPr>
                 <w:sz w:val="18"/>
               </w:rPr>
-              <w:t>Monitorización, alertas con responsables, backups cifrados de SQL y documentos y prueba de restauración.</w:t>
+              <w:t xml:space="preserve">Monitorización, alertas con responsables, </w:t>
+            </w:r>
+            <w:proofErr w:type="spellStart"/>
+            <w:r>
+              <w:rPr>
+                <w:sz w:val="18"/>
+              </w:rPr>
+              <w:t>backups</w:t>
+            </w:r>
+            <w:proofErr w:type="spellEnd"/>
+            <w:r>
+              <w:rPr>
+                <w:sz w:val="18"/>
+              </w:rPr>
+              <w:t xml:space="preserve"> cifrados de SQL y documentos y prueba de restauración.</w:t>
             </w:r>
           </w:p>
         </w:tc>
@@ -6308,12 +6695,21 @@
             <w:pPr>
               <w:spacing w:after="0"/>
             </w:pPr>
+            <w:proofErr w:type="gramStart"/>
             <w:r>
               <w:rPr>
                 <w:b/>
                 <w:sz w:val="18"/>
               </w:rPr>
-              <w:t>Total estimado (jornadas)</w:t>
+              <w:t>Total</w:t>
+            </w:r>
+            <w:proofErr w:type="gramEnd"/>
+            <w:r>
+              <w:rPr>
+                <w:b/>
+                <w:sz w:val="18"/>
+              </w:rPr>
+              <w:t xml:space="preserve"> estimado (jornadas)</w:t>
             </w:r>
           </w:p>
         </w:tc>
@@ -6737,7 +7133,23 @@
                 <w:b/>
                 <w:sz w:val="18"/>
               </w:rPr>
-              <w:t>Desarrolladores full-stack (2)</w:t>
+              <w:t>Desarrolladores full-</w:t>
+            </w:r>
+            <w:proofErr w:type="spellStart"/>
+            <w:r>
+              <w:rPr>
+                <w:b/>
+                <w:sz w:val="18"/>
+              </w:rPr>
+              <w:t>stack</w:t>
+            </w:r>
+            <w:proofErr w:type="spellEnd"/>
+            <w:r>
+              <w:rPr>
+                <w:b/>
+                <w:sz w:val="18"/>
+              </w:rPr>
+              <w:t xml:space="preserve"> (2)</w:t>
             </w:r>
           </w:p>
         </w:tc>
@@ -6832,7 +7244,21 @@
               <w:rPr>
                 <w:sz w:val="18"/>
               </w:rPr>
-              <w:t>Plan de pruebas, Playwright, rendimiento, accesibilidad y UAT</w:t>
+              <w:t xml:space="preserve">Plan de pruebas, </w:t>
+            </w:r>
+            <w:proofErr w:type="spellStart"/>
+            <w:r>
+              <w:rPr>
+                <w:sz w:val="18"/>
+              </w:rPr>
+              <w:t>Playwright</w:t>
+            </w:r>
+            <w:proofErr w:type="spellEnd"/>
+            <w:r>
+              <w:rPr>
+                <w:sz w:val="18"/>
+              </w:rPr>
+              <w:t>, rendimiento, accesibilidad y UAT</w:t>
             </w:r>
           </w:p>
         </w:tc>
@@ -6896,7 +7322,23 @@
                 <w:color w:val="FFFFFF"/>
                 <w:sz w:val="18"/>
               </w:rPr>
-              <w:t>Entornos, CI/CD, despliegue, supervisión y backups (mayor en opción A por coordinación con IT)</w:t>
+              <w:t xml:space="preserve">Entornos, CI/CD, despliegue, supervisión y </w:t>
+            </w:r>
+            <w:proofErr w:type="spellStart"/>
+            <w:r>
+              <w:rPr>
+                <w:color w:val="FFFFFF"/>
+                <w:sz w:val="18"/>
+              </w:rPr>
+              <w:t>backups</w:t>
+            </w:r>
+            <w:proofErr w:type="spellEnd"/>
+            <w:r>
+              <w:rPr>
+                <w:color w:val="FFFFFF"/>
+                <w:sz w:val="18"/>
+              </w:rPr>
+              <w:t xml:space="preserve"> (mayor en opción A por coordinación con IT)</w:t>
             </w:r>
           </w:p>
         </w:tc>
@@ -7065,7 +7507,21 @@
               <w:rPr>
                 <w:sz w:val="18"/>
               </w:rPr>
-              <w:t xml:space="preserve">Producción: 2 nodos de 4 vCPU y </w:t>
+              <w:t xml:space="preserve">Producción: 2 nodos de 4 </w:t>
+            </w:r>
+            <w:proofErr w:type="spellStart"/>
+            <w:r>
+              <w:rPr>
+                <w:sz w:val="18"/>
+              </w:rPr>
+              <w:t>vCPU</w:t>
+            </w:r>
+            <w:proofErr w:type="spellEnd"/>
+            <w:r>
+              <w:rPr>
+                <w:sz w:val="18"/>
+              </w:rPr>
+              <w:t xml:space="preserve"> y </w:t>
             </w:r>
             <w:r>
               <w:rPr>
@@ -7077,7 +7533,21 @@
               <w:rPr>
                 <w:sz w:val="18"/>
               </w:rPr>
-              <w:t xml:space="preserve"> GB RAM (o 1 nodo si se acepta menor disponibilidad). Preproducción: 2 vCPU y 4 GB. Windows Server 2022 o Linux con Node.js 24 LTS, o contenedores.</w:t>
+              <w:t xml:space="preserve"> GB RAM (o 1 nodo si se acepta menor disponibilidad). Preproducción: 2 </w:t>
+            </w:r>
+            <w:proofErr w:type="spellStart"/>
+            <w:r>
+              <w:rPr>
+                <w:sz w:val="18"/>
+              </w:rPr>
+              <w:t>vCPU</w:t>
+            </w:r>
+            <w:proofErr w:type="spellEnd"/>
+            <w:r>
+              <w:rPr>
+                <w:sz w:val="18"/>
+              </w:rPr>
+              <w:t xml:space="preserve"> y 4 GB. Windows Server 2022 o Linux con Node.js 24 LTS, o contenedores.</w:t>
             </w:r>
           </w:p>
         </w:tc>
@@ -7116,24 +7586,28 @@
             <w:pPr>
               <w:spacing w:after="0"/>
             </w:pPr>
+            <w:proofErr w:type="spellStart"/>
             <w:r>
               <w:rPr>
                 <w:sz w:val="18"/>
               </w:rPr>
               <w:t>Supabase</w:t>
             </w:r>
+            <w:proofErr w:type="spellEnd"/>
             <w:r>
               <w:rPr>
                 <w:sz w:val="18"/>
               </w:rPr>
               <w:t xml:space="preserve"> </w:t>
             </w:r>
+            <w:proofErr w:type="spellStart"/>
             <w:r>
               <w:rPr>
                 <w:sz w:val="18"/>
               </w:rPr>
               <w:t>self-hosted</w:t>
             </w:r>
+            <w:proofErr w:type="spellEnd"/>
             <w:r>
               <w:rPr>
                 <w:sz w:val="18"/>
@@ -7179,7 +7653,21 @@
               <w:rPr>
                 <w:sz w:val="18"/>
               </w:rPr>
-              <w:t>Almacenamiento privado con backup, 250 GB iniciales ampliables. Compartido entre nodos si hay más de uno.</w:t>
+              <w:t xml:space="preserve">Almacenamiento privado con </w:t>
+            </w:r>
+            <w:proofErr w:type="spellStart"/>
+            <w:r>
+              <w:rPr>
+                <w:sz w:val="18"/>
+              </w:rPr>
+              <w:t>backup</w:t>
+            </w:r>
+            <w:proofErr w:type="spellEnd"/>
+            <w:r>
+              <w:rPr>
+                <w:sz w:val="18"/>
+              </w:rPr>
+              <w:t>, 250 GB iniciales ampliables. Compartido entre nodos si hay más de uno.</w:t>
             </w:r>
           </w:p>
         </w:tc>
@@ -7263,7 +7751,23 @@
               <w:rPr>
                 <w:sz w:val="18"/>
               </w:rPr>
-              <w:t>Portal del cliente accesible desde internet: proxy inverso o WAF en DMZ, certificado TLS y dominio (p. ej. clientes.rcd.legal).</w:t>
+              <w:t xml:space="preserve">Portal del cliente accesible desde internet: proxy inverso o WAF en DMZ, certificado TLS y dominio (p. ej. </w:t>
+            </w:r>
+            <w:proofErr w:type="spellStart"/>
+            <w:proofErr w:type="gramStart"/>
+            <w:r>
+              <w:rPr>
+                <w:sz w:val="18"/>
+              </w:rPr>
+              <w:t>clientes.rcd.legal</w:t>
+            </w:r>
+            <w:proofErr w:type="spellEnd"/>
+            <w:proofErr w:type="gramEnd"/>
+            <w:r>
+              <w:rPr>
+                <w:sz w:val="18"/>
+              </w:rPr>
+              <w:t>).</w:t>
             </w:r>
           </w:p>
         </w:tc>
@@ -7306,7 +7810,21 @@
               <w:rPr>
                 <w:sz w:val="18"/>
               </w:rPr>
-              <w:t>Registro de aplicación en Entra ID para SSO; Microsoft Graph o SMTP autenticado para el envío de correo.</w:t>
+              <w:t xml:space="preserve">Registro de aplicación en Entra ID para SSO; Microsoft </w:t>
+            </w:r>
+            <w:proofErr w:type="spellStart"/>
+            <w:r>
+              <w:rPr>
+                <w:sz w:val="18"/>
+              </w:rPr>
+              <w:t>Graph</w:t>
+            </w:r>
+            <w:proofErr w:type="spellEnd"/>
+            <w:r>
+              <w:rPr>
+                <w:sz w:val="18"/>
+              </w:rPr>
+              <w:t xml:space="preserve"> o SMTP autenticado para el envío de correo.</w:t>
             </w:r>
           </w:p>
         </w:tc>
@@ -7346,12 +7864,21 @@
             <w:pPr>
               <w:spacing w:after="0"/>
             </w:pPr>
+            <w:proofErr w:type="spellStart"/>
             <w:r>
               <w:rPr>
                 <w:color w:val="FFFFFF"/>
                 <w:sz w:val="18"/>
               </w:rPr>
-              <w:t>Backup de SQL y documentos coherente, supervisión, parches de sistema operativo y gestión de secretos.</w:t>
+              <w:t>Backup</w:t>
+            </w:r>
+            <w:proofErr w:type="spellEnd"/>
+            <w:r>
+              <w:rPr>
+                <w:color w:val="FFFFFF"/>
+                <w:sz w:val="18"/>
+              </w:rPr>
+              <w:t xml:space="preserve"> de SQL y documentos coherente, supervisión, parches de sistema operativo y gestión de secretos.</w:t>
             </w:r>
           </w:p>
         </w:tc>
@@ -13014,12 +13541,21 @@
             <w:pPr>
               <w:spacing w:after="0"/>
             </w:pPr>
+            <w:proofErr w:type="spellStart"/>
             <w:r>
               <w:rPr>
                 <w:b/>
                 <w:sz w:val="18"/>
               </w:rPr>
-              <w:t>Backups y restauración</w:t>
+              <w:t>Backups</w:t>
+            </w:r>
+            <w:proofErr w:type="spellEnd"/>
+            <w:r>
+              <w:rPr>
+                <w:b/>
+                <w:sz w:val="18"/>
+              </w:rPr>
+              <w:t xml:space="preserve"> y restauración</w:t>
             </w:r>
           </w:p>
         </w:tc>
@@ -13284,7 +13820,15 @@
         <w:t>Soporte Haley recomendado:</w:t>
       </w:r>
       <w:r>
-        <w:t xml:space="preserve"> bolsa de 3–4 jornadas/mes para correctivos, actualizaciones de seguridad de dependencias (Node.js, Nuxt, Prisma) y ajustes de campaña; ampliable en picos.</w:t>
+        <w:t xml:space="preserve"> bolsa de 3–4 jornadas/mes para correctivos, actualizaciones de seguridad de dependencias (Node.js, </w:t>
+      </w:r>
+      <w:proofErr w:type="spellStart"/>
+      <w:r>
+        <w:t>Nuxt</w:t>
+      </w:r>
+      <w:proofErr w:type="spellEnd"/>
+      <w:r>
+        <w:t>, Prisma) y ajustes de campaña; ampliable en picos.</w:t>
       </w:r>
     </w:p>
     <w:p>
@@ -13555,7 +14099,35 @@
               <w:rPr>
                 <w:sz w:val="18"/>
               </w:rPr>
-              <w:t>Azure SQL Database con backups automáticos y restauración a un momento dado.</w:t>
+              <w:t xml:space="preserve">Azure SQL </w:t>
+            </w:r>
+            <w:proofErr w:type="spellStart"/>
+            <w:r>
+              <w:rPr>
+                <w:sz w:val="18"/>
+              </w:rPr>
+              <w:t>Database</w:t>
+            </w:r>
+            <w:proofErr w:type="spellEnd"/>
+            <w:r>
+              <w:rPr>
+                <w:sz w:val="18"/>
+              </w:rPr>
+              <w:t xml:space="preserve"> con </w:t>
+            </w:r>
+            <w:proofErr w:type="spellStart"/>
+            <w:r>
+              <w:rPr>
+                <w:sz w:val="18"/>
+              </w:rPr>
+              <w:t>backups</w:t>
+            </w:r>
+            <w:proofErr w:type="spellEnd"/>
+            <w:r>
+              <w:rPr>
+                <w:sz w:val="18"/>
+              </w:rPr>
+              <w:t xml:space="preserve"> automáticos y restauración a un momento dado.</w:t>
             </w:r>
           </w:p>
         </w:tc>
@@ -13596,7 +14168,21 @@
               <w:rPr>
                 <w:sz w:val="18"/>
               </w:rPr>
-              <w:t>Azure Blob Storage privado con análisis antimalware (Defender for Storage), cifrado y versionado.</w:t>
+              <w:t xml:space="preserve">Azure Blob Storage privado con análisis antimalware (Defender </w:t>
+            </w:r>
+            <w:proofErr w:type="spellStart"/>
+            <w:r>
+              <w:rPr>
+                <w:sz w:val="18"/>
+              </w:rPr>
+              <w:t>for</w:t>
+            </w:r>
+            <w:proofErr w:type="spellEnd"/>
+            <w:r>
+              <w:rPr>
+                <w:sz w:val="18"/>
+              </w:rPr>
+              <w:t xml:space="preserve"> Storage), cifrado y versionado.</w:t>
             </w:r>
           </w:p>
         </w:tc>
@@ -13680,7 +14266,35 @@
               <w:rPr>
                 <w:sz w:val="18"/>
               </w:rPr>
-              <w:t>Azure Monitor y Application Insights, alertas, registro de auditoría y CI/CD con despliegue sin corte.</w:t>
+              <w:t xml:space="preserve">Azure Monitor y </w:t>
+            </w:r>
+            <w:proofErr w:type="spellStart"/>
+            <w:r>
+              <w:rPr>
+                <w:sz w:val="18"/>
+              </w:rPr>
+              <w:t>Application</w:t>
+            </w:r>
+            <w:proofErr w:type="spellEnd"/>
+            <w:r>
+              <w:rPr>
+                <w:sz w:val="18"/>
+              </w:rPr>
+              <w:t xml:space="preserve"> </w:t>
+            </w:r>
+            <w:proofErr w:type="spellStart"/>
+            <w:r>
+              <w:rPr>
+                <w:sz w:val="18"/>
+              </w:rPr>
+              <w:t>Insights</w:t>
+            </w:r>
+            <w:proofErr w:type="spellEnd"/>
+            <w:r>
+              <w:rPr>
+                <w:sz w:val="18"/>
+              </w:rPr>
+              <w:t>, alertas, registro de auditoría y CI/CD con despliegue sin corte.</w:t>
             </w:r>
           </w:p>
         </w:tc>
@@ -14790,7 +15404,21 @@
               <w:rPr>
                 <w:sz w:val="16"/>
               </w:rPr>
-              <w:t>Entornos cloud, CI/CD y supervisión</w:t>
+              <w:t xml:space="preserve">Entornos </w:t>
+            </w:r>
+            <w:proofErr w:type="spellStart"/>
+            <w:r>
+              <w:rPr>
+                <w:sz w:val="16"/>
+              </w:rPr>
+              <w:t>cloud</w:t>
+            </w:r>
+            <w:proofErr w:type="spellEnd"/>
+            <w:r>
+              <w:rPr>
+                <w:sz w:val="16"/>
+              </w:rPr>
+              <w:t>, CI/CD y supervisión</w:t>
             </w:r>
           </w:p>
         </w:tc>
@@ -17721,10 +18349,27 @@
     </w:p>
     <w:p>
       <w:pPr>
-        <w:pStyle w:val="Ttulo2"/>
+        <w:spacing w:line="276" w:lineRule="auto"/>
+        <w:rPr>
+          <w:rFonts w:asciiTheme="majorHAnsi" w:eastAsiaTheme="majorEastAsia" w:hAnsiTheme="majorHAnsi" w:cstheme="majorBidi"/>
+          <w:b/>
+          <w:bCs/>
+          <w:color w:val="1B3656"/>
+          <w:sz w:val="26"/>
+          <w:szCs w:val="26"/>
+        </w:rPr>
       </w:pPr>
       <w:bookmarkStart w:id="18" w:name="_Toc241700982"/>
       <w:r>
+        <w:br w:type="page"/>
+      </w:r>
+    </w:p>
+    <w:p>
+      <w:pPr>
+        <w:pStyle w:val="Ttulo2"/>
+      </w:pPr>
+      <w:r>
+        <w:lastRenderedPageBreak/>
         <w:t>7.3. Hitos</w:t>
       </w:r>
       <w:bookmarkEnd w:id="18"/>
@@ -18015,7 +18660,6 @@
                 <w:b/>
                 <w:sz w:val="18"/>
               </w:rPr>
-              <w:lastRenderedPageBreak/>
               <w:t>E3 · Modelo 720 en producción</w:t>
             </w:r>
           </w:p>
@@ -18488,6 +19132,7 @@
             <w:pPr>
               <w:spacing w:after="0"/>
             </w:pPr>
+            <w:proofErr w:type="spellStart"/>
             <w:r>
               <w:rPr>
                 <w:b/>
@@ -18496,6 +19141,7 @@
               </w:rPr>
               <w:t>Backups</w:t>
             </w:r>
+            <w:proofErr w:type="spellEnd"/>
           </w:p>
         </w:tc>
         <w:tc>
@@ -18708,12 +19354,21 @@
             <w:pPr>
               <w:spacing w:after="0"/>
             </w:pPr>
+            <w:proofErr w:type="spellStart"/>
             <w:r>
               <w:rPr>
                 <w:b/>
                 <w:sz w:val="18"/>
               </w:rPr>
-              <w:t>Backups, restauración y continuidad</w:t>
+              <w:t>Backups</w:t>
+            </w:r>
+            <w:proofErr w:type="spellEnd"/>
+            <w:r>
+              <w:rPr>
+                <w:b/>
+                <w:sz w:val="18"/>
+              </w:rPr>
+              <w:t>, restauración y continuidad</w:t>
             </w:r>
           </w:p>
         </w:tc>
@@ -19003,10 +19658,27 @@
     </w:p>
     <w:p>
       <w:pPr>
-        <w:pStyle w:val="Ttulo2"/>
+        <w:spacing w:line="276" w:lineRule="auto"/>
+        <w:rPr>
+          <w:rFonts w:asciiTheme="majorHAnsi" w:eastAsiaTheme="majorEastAsia" w:hAnsiTheme="majorHAnsi" w:cstheme="majorBidi"/>
+          <w:b/>
+          <w:bCs/>
+          <w:color w:val="1B3656"/>
+          <w:sz w:val="26"/>
+          <w:szCs w:val="26"/>
+        </w:rPr>
       </w:pPr>
       <w:bookmarkStart w:id="21" w:name="_Toc241700985"/>
       <w:r>
+        <w:br w:type="page"/>
+      </w:r>
+    </w:p>
+    <w:p>
+      <w:pPr>
+        <w:pStyle w:val="Ttulo2"/>
+      </w:pPr>
+      <w:r>
+        <w:lastRenderedPageBreak/>
         <w:t>7.6. Costes recurrentes orientativos</w:t>
       </w:r>
       <w:bookmarkEnd w:id="21"/>
@@ -19136,7 +19808,25 @@
               <w:rPr>
                 <w:sz w:val="18"/>
               </w:rPr>
-              <w:t>450–900 €/mes</w:t>
+              <w:t>50</w:t>
+            </w:r>
+            <w:r>
+              <w:rPr>
+                <w:sz w:val="18"/>
+              </w:rPr>
+              <w:t>0–</w:t>
+            </w:r>
+            <w:r>
+              <w:rPr>
+                <w:sz w:val="18"/>
+              </w:rPr>
+              <w:t>1.4</w:t>
+            </w:r>
+            <w:r>
+              <w:rPr>
+                <w:sz w:val="18"/>
+              </w:rPr>
+              <w:t>00 €/mes</w:t>
             </w:r>
           </w:p>
         </w:tc>
@@ -19214,7 +19904,21 @@
               <w:rPr>
                 <w:sz w:val="18"/>
               </w:rPr>
-              <w:t>Operación, supervisión, parches, backups, soporte y ajustes menores</w:t>
+              <w:t xml:space="preserve">Operación, supervisión, parches, </w:t>
+            </w:r>
+            <w:proofErr w:type="spellStart"/>
+            <w:r>
+              <w:rPr>
+                <w:sz w:val="18"/>
+              </w:rPr>
+              <w:t>backups</w:t>
+            </w:r>
+            <w:proofErr w:type="spellEnd"/>
+            <w:r>
+              <w:rPr>
+                <w:sz w:val="18"/>
+              </w:rPr>
+              <w:t>, soporte y ajustes menores</w:t>
             </w:r>
           </w:p>
         </w:tc>
@@ -19273,12 +19977,21 @@
             <w:pPr>
               <w:spacing w:after="0"/>
             </w:pPr>
+            <w:proofErr w:type="spellStart"/>
             <w:r>
               <w:rPr>
                 <w:color w:val="FFFFFF"/>
                 <w:sz w:val="18"/>
               </w:rPr>
-              <w:t>Signaturit, IA del extractor y, si procede, proveedor de correo</w:t>
+              <w:t>Signaturit</w:t>
+            </w:r>
+            <w:proofErr w:type="spellEnd"/>
+            <w:r>
+              <w:rPr>
+                <w:color w:val="FFFFFF"/>
+                <w:sz w:val="18"/>
+              </w:rPr>
+              <w:t>, IA del extractor y, si procede, proveedor de correo</w:t>
             </w:r>
           </w:p>
         </w:tc>
@@ -19297,7 +20010,6 @@
         <w:rPr>
           <w:sz w:val="19"/>
         </w:rPr>
-        <w:lastRenderedPageBreak/>
         <w:t>Sin licencias por usuario interno ni por contacto de cliente. La cuota definitiva se cerrará tras dimensionar volúmenes en la fase 0.</w:t>
       </w:r>
     </w:p>
@@ -20026,10 +20738,27 @@
     </w:p>
     <w:p>
       <w:pPr>
-        <w:pStyle w:val="Ttulo1"/>
+        <w:spacing w:line="276" w:lineRule="auto"/>
+        <w:rPr>
+          <w:rFonts w:asciiTheme="majorHAnsi" w:eastAsiaTheme="majorEastAsia" w:hAnsiTheme="majorHAnsi" w:cstheme="majorBidi"/>
+          <w:b/>
+          <w:bCs/>
+          <w:color w:val="1F497D" w:themeColor="text2"/>
+          <w:sz w:val="34"/>
+          <w:szCs w:val="28"/>
+        </w:rPr>
       </w:pPr>
       <w:bookmarkStart w:id="24" w:name="_Toc241700988"/>
       <w:r>
+        <w:br w:type="page"/>
+      </w:r>
+    </w:p>
+    <w:p>
+      <w:pPr>
+        <w:pStyle w:val="Ttulo1"/>
+      </w:pPr>
+      <w:r>
+        <w:lastRenderedPageBreak/>
         <w:t>9. Supuestos y dependencias</w:t>
       </w:r>
       <w:bookmarkEnd w:id="24"/>
@@ -20067,7 +20796,23 @@
         <w:spacing w:after="40"/>
       </w:pPr>
       <w:r>
-        <w:t>RCD aporta cuenta de Signaturit con entorno de pruebas, acceso a Entra ID para el SSO y el prompt del extractor 720.</w:t>
+        <w:t xml:space="preserve">RCD aporta cuenta de </w:t>
+      </w:r>
+      <w:proofErr w:type="spellStart"/>
+      <w:r>
+        <w:t>Signaturit</w:t>
+      </w:r>
+      <w:proofErr w:type="spellEnd"/>
+      <w:r>
+        <w:t xml:space="preserve"> con entorno de pruebas, acceso a Entra ID para el SSO y el </w:t>
+      </w:r>
+      <w:proofErr w:type="spellStart"/>
+      <w:r>
+        <w:t>prompt</w:t>
+      </w:r>
+      <w:proofErr w:type="spellEnd"/>
+      <w:r>
+        <w:t xml:space="preserve"> del extractor 720.</w:t>
       </w:r>
     </w:p>
     <w:p>
@@ -20085,8 +20830,15 @@
         <w:spacing w:after="40"/>
       </w:pPr>
       <w:r>
-        <w:lastRenderedPageBreak/>
-        <w:t>Alta en NAV, carga en Criteria, presentación en la AEAT y confirmación del cobro siguen siendo manuales.</w:t>
+        <w:t xml:space="preserve">Alta en NAV, carga en </w:t>
+      </w:r>
+      <w:proofErr w:type="spellStart"/>
+      <w:r>
+        <w:t>Criteria</w:t>
+      </w:r>
+      <w:proofErr w:type="spellEnd"/>
+      <w:r>
+        <w:t>, presentación en la AEAT y confirmación del cobro siguen siendo manuales.</w:t>
       </w:r>
     </w:p>
     <w:p>
@@ -20095,7 +20847,15 @@
         <w:spacing w:after="40"/>
       </w:pPr>
       <w:r>
-        <w:t>Plantillas de correo, PH, checklists, tarifas y calendario fiscal las aporta y aprueba RCD.</w:t>
+        <w:t xml:space="preserve">Plantillas de correo, PH, </w:t>
+      </w:r>
+      <w:proofErr w:type="spellStart"/>
+      <w:r>
+        <w:t>checklists</w:t>
+      </w:r>
+      <w:proofErr w:type="spellEnd"/>
+      <w:r>
+        <w:t>, tarifas y calendario fiscal las aporta y aprueba RCD.</w:t>
       </w:r>
     </w:p>
     <w:p>
@@ -20104,7 +20864,15 @@
         <w:spacing w:after="40"/>
       </w:pPr>
       <w:r>
-        <w:t>Las integraciones no previstas (p. ej. API de NAV o de Criteria) se valorarán como cambio de alcance.</w:t>
+        <w:t xml:space="preserve">Las integraciones no previstas (p. ej. API de NAV o de </w:t>
+      </w:r>
+      <w:proofErr w:type="spellStart"/>
+      <w:r>
+        <w:t>Criteria</w:t>
+      </w:r>
+      <w:proofErr w:type="spellEnd"/>
+      <w:r>
+        <w:t>) se valorarán como cambio de alcance.</w:t>
       </w:r>
     </w:p>
     <w:p>
@@ -20113,7 +20881,15 @@
         <w:spacing w:after="40"/>
       </w:pPr>
       <w:r>
-        <w:t>Costes de terceros (licencias Signaturit, consumo de IA, certificados, auditoría externa) no incluidos en las jornadas.</w:t>
+        <w:t xml:space="preserve">Costes de terceros (licencias </w:t>
+      </w:r>
+      <w:proofErr w:type="spellStart"/>
+      <w:r>
+        <w:t>Signaturit</w:t>
+      </w:r>
+      <w:proofErr w:type="spellEnd"/>
+      <w:r>
+        <w:t>, consumo de IA, certificados, auditoría externa) no incluidos en las jornadas.</w:t>
       </w:r>
     </w:p>
     <w:p>
@@ -20472,7 +21248,23 @@
                 <w:b/>
                 <w:sz w:val="18"/>
               </w:rPr>
-              <w:t>Formularios, tarifas, checklists, plazos y días hábiles/naturales</w:t>
+              <w:t xml:space="preserve">Formularios, tarifas, </w:t>
+            </w:r>
+            <w:proofErr w:type="spellStart"/>
+            <w:r>
+              <w:rPr>
+                <w:b/>
+                <w:sz w:val="18"/>
+              </w:rPr>
+              <w:t>checklists</w:t>
+            </w:r>
+            <w:proofErr w:type="spellEnd"/>
+            <w:r>
+              <w:rPr>
+                <w:b/>
+                <w:sz w:val="18"/>
+              </w:rPr>
+              <w:t>, plazos y días hábiles/naturales</w:t>
             </w:r>
           </w:p>
         </w:tc>
@@ -20591,7 +21383,23 @@
                 <w:b/>
                 <w:sz w:val="18"/>
               </w:rPr>
-              <w:t>Campos NAV, formato Criteria y alcance del extractor</w:t>
+              <w:t xml:space="preserve">Campos NAV, formato </w:t>
+            </w:r>
+            <w:proofErr w:type="spellStart"/>
+            <w:r>
+              <w:rPr>
+                <w:b/>
+                <w:sz w:val="18"/>
+              </w:rPr>
+              <w:t>Criteria</w:t>
+            </w:r>
+            <w:proofErr w:type="spellEnd"/>
+            <w:r>
+              <w:rPr>
+                <w:b/>
+                <w:sz w:val="18"/>
+              </w:rPr>
+              <w:t xml:space="preserve"> y alcance del extractor</w:t>
             </w:r>
           </w:p>
         </w:tc>
@@ -20949,6 +21757,7 @@
                 <w:b/>
                 <w:sz w:val="18"/>
               </w:rPr>
+              <w:lastRenderedPageBreak/>
               <w:t>Aprovisionamiento lento de infraestructura (opción A)</w:t>
             </w:r>
           </w:p>
@@ -21128,7 +21937,23 @@
                 <w:b/>
                 <w:sz w:val="18"/>
               </w:rPr>
-              <w:t>Dependencias de terceros (Signaturit, correo)</w:t>
+              <w:t>Dependencias de terceros (</w:t>
+            </w:r>
+            <w:proofErr w:type="spellStart"/>
+            <w:r>
+              <w:rPr>
+                <w:b/>
+                <w:sz w:val="18"/>
+              </w:rPr>
+              <w:t>Signaturit</w:t>
+            </w:r>
+            <w:proofErr w:type="spellEnd"/>
+            <w:r>
+              <w:rPr>
+                <w:b/>
+                <w:sz w:val="18"/>
+              </w:rPr>
+              <w:t>, correo)</w:t>
             </w:r>
           </w:p>
         </w:tc>
@@ -21188,7 +22013,6 @@
                 <w:b/>
                 <w:sz w:val="18"/>
               </w:rPr>
-              <w:lastRenderedPageBreak/>
               <w:t>Pico de carga al inicio de campaña</w:t>
             </w:r>
           </w:p>

</xml_diff>